<commit_message>
Move anuncio physical and technical data to evaluation
</commit_message>
<xml_diff>
--- a/plantillas_publicidad/certificado_letras_recortadas.docx
+++ b/plantillas_publicidad/certificado_letras_recortadas.docx
@@ -569,62 +569,6 @@
           <w:rFonts w:ascii="Arial Narrow" w:hAnsi="Arial Narrow"/>
           <w:b/>
           <w:bCs/>
-          <w:sz w:val="24"/>
-          <w:szCs w:val="24"/>
-        </w:rPr>
-      </w:pPr>
-      <w:r>
-        <w:rPr>
-          <w:rFonts w:ascii="Arial Narrow" w:hAnsi="Arial Narrow"/>
-          <w:b/>
-          <w:bCs/>
-        </w:rPr>
-        <w:t>LEYENDA</w:t>
-      </w:r>
-      <w:r>
-        <w:rPr>
-          <w:rFonts w:ascii="Arial Narrow" w:hAnsi="Arial Narrow"/>
-          <w:b/>
-          <w:bCs/>
-        </w:rPr>
-        <w:tab/>
-      </w:r>
-      <w:r>
-        <w:rPr>
-          <w:rFonts w:ascii="Arial Narrow" w:hAnsi="Arial Narrow"/>
-          <w:b/>
-          <w:bCs/>
-        </w:rPr>
-        <w:tab/>
-        <w:t>:</w:t>
-      </w:r>
-      <w:r>
-        <w:rPr>
-          <w:rFonts w:ascii="Arial Narrow" w:hAnsi="Arial Narrow"/>
-          <w:b/>
-          <w:bCs/>
-        </w:rPr>
-        <w:tab/>
-      </w:r>
-      <w:r>
-        <w:rPr>
-          <w:rFonts w:ascii="Arial Narrow" w:hAnsi="Arial Narrow" w:cstheme="minorHAnsi"/>
-          <w:b/>
-          <w:bCs/>
-          <w:noProof/>
-          <w:lang w:val="es-ES"/>
-        </w:rPr>
-        <w:t>{{leyenda}}</w:t>
-      </w:r>
-    </w:p>
-    <w:p>
-      <w:pPr>
-        <w:pStyle w:val="Sinespaciado"/>
-        <w:jc w:val="both"/>
-        <w:rPr>
-          <w:rFonts w:ascii="Arial Narrow" w:hAnsi="Arial Narrow"/>
-          <w:b/>
-          <w:bCs/>
           <w:noProof/>
         </w:rPr>
       </w:pPr>
@@ -936,68 +880,6 @@
           <w:rFonts w:ascii="Arial Narrow" w:hAnsi="Arial Narrow"/>
           <w:b/>
           <w:bCs/>
-        </w:rPr>
-      </w:pPr>
-      <w:r>
-        <w:rPr>
-          <w:rFonts w:ascii="Arial Narrow" w:hAnsi="Arial Narrow"/>
-          <w:b/>
-          <w:bCs/>
-        </w:rPr>
-        <w:t>COLOR</w:t>
-      </w:r>
-      <w:r>
-        <w:rPr>
-          <w:rFonts w:ascii="Arial Narrow" w:hAnsi="Arial Narrow"/>
-          <w:b/>
-          <w:bCs/>
-        </w:rPr>
-        <w:tab/>
-      </w:r>
-      <w:r>
-        <w:rPr>
-          <w:rFonts w:ascii="Arial Narrow" w:hAnsi="Arial Narrow"/>
-          <w:b/>
-          <w:bCs/>
-        </w:rPr>
-        <w:tab/>
-      </w:r>
-      <w:r>
-        <w:rPr>
-          <w:rFonts w:ascii="Arial Narrow" w:hAnsi="Arial Narrow"/>
-          <w:b/>
-          <w:bCs/>
-        </w:rPr>
-        <w:tab/>
-        <w:t>:</w:t>
-      </w:r>
-      <w:r>
-        <w:rPr>
-          <w:rFonts w:ascii="Arial Narrow" w:hAnsi="Arial Narrow"/>
-          <w:b/>
-          <w:bCs/>
-        </w:rPr>
-        <w:tab/>
-      </w:r>
-      <w:r>
-        <w:rPr>
-          <w:rFonts w:ascii="Arial Narrow" w:hAnsi="Arial Narrow" w:cstheme="minorHAnsi"/>
-          <w:b/>
-          <w:bCs/>
-          <w:noProof/>
-          <w:lang w:val="es-ES"/>
-        </w:rPr>
-        <w:t>{{color}}</w:t>
-      </w:r>
-    </w:p>
-    <w:p>
-      <w:pPr>
-        <w:pStyle w:val="Sinespaciado"/>
-        <w:jc w:val="both"/>
-        <w:rPr>
-          <w:rFonts w:ascii="Arial Narrow" w:hAnsi="Arial Narrow"/>
-          <w:b/>
-          <w:bCs/>
           <w:noProof/>
         </w:rPr>
       </w:pPr>
@@ -1047,280 +929,6 @@
     <w:p>
       <w:pPr>
         <w:pStyle w:val="Sinespaciado"/>
-        <w:jc w:val="both"/>
-        <w:rPr>
-          <w:rFonts w:ascii="Arial Narrow" w:hAnsi="Arial Narrow"/>
-          <w:b/>
-          <w:bCs/>
-        </w:rPr>
-      </w:pPr>
-      <w:r>
-        <w:rPr>
-          <w:rFonts w:ascii="Arial Narrow" w:hAnsi="Arial Narrow"/>
-          <w:b/>
-          <w:bCs/>
-        </w:rPr>
-        <w:t xml:space="preserve">CARAS </w:t>
-      </w:r>
-      <w:r>
-        <w:rPr>
-          <w:rFonts w:ascii="Arial Narrow" w:hAnsi="Arial Narrow"/>
-          <w:b/>
-          <w:bCs/>
-        </w:rPr>
-        <w:tab/>
-      </w:r>
-      <w:r>
-        <w:rPr>
-          <w:rFonts w:ascii="Arial Narrow" w:hAnsi="Arial Narrow"/>
-          <w:b/>
-          <w:bCs/>
-        </w:rPr>
-        <w:tab/>
-      </w:r>
-      <w:r>
-        <w:rPr>
-          <w:rFonts w:ascii="Arial Narrow" w:hAnsi="Arial Narrow"/>
-          <w:b/>
-          <w:bCs/>
-        </w:rPr>
-        <w:tab/>
-        <w:t>:</w:t>
-      </w:r>
-      <w:r>
-        <w:rPr>
-          <w:rFonts w:ascii="Arial Narrow" w:hAnsi="Arial Narrow"/>
-          <w:b/>
-          <w:bCs/>
-        </w:rPr>
-        <w:tab/>
-      </w:r>
-      <w:r>
-        <w:rPr>
-          <w:rFonts w:ascii="Arial Narrow" w:hAnsi="Arial Narrow"/>
-          <w:b/>
-          <w:bCs/>
-          <w:color w:val="FF0000"/>
-        </w:rPr>
-        <w:t>UNA</w:t>
-      </w:r>
-      <w:r>
-        <w:rPr>
-          <w:rFonts w:ascii="Arial Narrow" w:hAnsi="Arial Narrow"/>
-          <w:b/>
-          <w:bCs/>
-          <w:color w:val="FF0000"/>
-        </w:rPr>
-        <w:t xml:space="preserve"> </w:t>
-      </w:r>
-      <w:r>
-        <w:rPr>
-          <w:rFonts w:ascii="Arial Narrow" w:hAnsi="Arial Narrow"/>
-          <w:b/>
-          <w:bCs/>
-          <w:color w:val="FF0000"/>
-        </w:rPr>
-        <w:t>(</w:t>
-      </w:r>
-      <w:r>
-        <w:rPr>
-          <w:rFonts w:ascii="Arial Narrow" w:hAnsi="Arial Narrow"/>
-          <w:b/>
-          <w:bCs/>
-          <w:color w:val="FF0000"/>
-        </w:rPr>
-        <w:t>{{num_cara}}</w:t>
-      </w:r>
-      <w:r>
-        <w:rPr>
-          <w:rFonts w:ascii="Arial Narrow" w:hAnsi="Arial Narrow"/>
-          <w:b/>
-          <w:bCs/>
-          <w:color w:val="FF0000"/>
-        </w:rPr>
-        <w:t>)</w:t>
-      </w:r>
-      <w:r>
-        <w:rPr>
-          <w:rFonts w:ascii="Arial Narrow" w:hAnsi="Arial Narrow"/>
-          <w:b/>
-          <w:bCs/>
-          <w:color w:val="FF0000"/>
-        </w:rPr>
-        <w:t xml:space="preserve"> CARA</w:t>
-      </w:r>
-    </w:p>
-    <w:p>
-      <w:pPr>
-        <w:pStyle w:val="Sinespaciado"/>
-        <w:rPr>
-          <w:rFonts w:ascii="Arial Narrow" w:hAnsi="Arial Narrow"/>
-          <w:b/>
-        </w:rPr>
-      </w:pPr>
-    </w:p>
-    <w:p>
-      <w:pPr>
-        <w:pStyle w:val="Sinespaciado"/>
-        <w:ind w:left="-284"/>
-        <w:jc w:val="both"/>
-        <w:rPr>
-          <w:rFonts w:ascii="Arial Narrow" w:hAnsi="Arial Narrow"/>
-        </w:rPr>
-      </w:pPr>
-      <w:r>
-        <w:rPr>
-          <w:rFonts w:ascii="Arial Narrow" w:hAnsi="Arial Narrow"/>
-        </w:rPr>
-        <w:t>La Municipalidad está facultada para realizar labores de fiscalización de las actividades económicas autorizadas, con el fin de verificar el cumplimiento de las características autorizadas y su mantenimiento.</w:t>
-      </w:r>
-    </w:p>
-    <w:p>
-      <w:pPr>
-        <w:pStyle w:val="Sinespaciado"/>
-        <w:jc w:val="both"/>
-        <w:rPr>
-          <w:rFonts w:ascii="Arial Narrow" w:hAnsi="Arial Narrow"/>
-        </w:rPr>
-      </w:pPr>
-    </w:p>
-    <w:p>
-      <w:pPr>
-        <w:pStyle w:val="Sinespaciado"/>
-        <w:ind w:left="-284"/>
-        <w:jc w:val="both"/>
-        <w:rPr>
-          <w:rFonts w:ascii="Arial Narrow" w:hAnsi="Arial Narrow"/>
-        </w:rPr>
-      </w:pPr>
-      <w:r>
-        <w:rPr>
-          <w:rFonts w:ascii="Arial Narrow" w:hAnsi="Arial Narrow"/>
-          <w:b/>
-          <w:u w:val="single"/>
-        </w:rPr>
-        <w:t>OBSERVACIONES</w:t>
-      </w:r>
-      <w:r>
-        <w:rPr>
-          <w:rFonts w:ascii="Arial Narrow" w:hAnsi="Arial Narrow"/>
-        </w:rPr>
-        <w:t>:</w:t>
-      </w:r>
-    </w:p>
-    <w:p>
-      <w:pPr>
-        <w:pStyle w:val="Sinespaciado"/>
-        <w:jc w:val="both"/>
-        <w:rPr>
-          <w:rFonts w:ascii="Arial Narrow" w:hAnsi="Arial Narrow"/>
-        </w:rPr>
-      </w:pPr>
-    </w:p>
-    <w:p>
-      <w:pPr>
-        <w:pStyle w:val="Sinespaciado"/>
-        <w:ind w:left="-284"/>
-        <w:jc w:val="both"/>
-        <w:rPr>
-          <w:rFonts w:ascii="Arial Narrow" w:hAnsi="Arial Narrow"/>
-        </w:rPr>
-      </w:pPr>
-      <w:r>
-        <w:rPr>
-          <w:rFonts w:ascii="Arial Narrow" w:hAnsi="Arial Narrow"/>
-        </w:rPr>
-        <w:t>El establecimiento no debe ser objeto de quejas de vecinos fundadas, o de alterar o instalar un anuncio con características distintas a las autorizada bajo apercibimiento de aplicarse las sanciones correspondientes y la revocatoria de la autorización de la misma.</w:t>
-      </w:r>
-    </w:p>
-    <w:p>
-      <w:pPr>
-        <w:pStyle w:val="Sinespaciado"/>
-        <w:rPr>
-          <w:rFonts w:ascii="Arial Narrow" w:hAnsi="Arial Narrow"/>
-          <w:b/>
-        </w:rPr>
-      </w:pPr>
-    </w:p>
-    <w:p>
-      <w:pPr>
-        <w:pStyle w:val="Sinespaciado"/>
-        <w:rPr>
-          <w:rFonts w:ascii="Arial Narrow" w:hAnsi="Arial Narrow"/>
-          <w:b/>
-        </w:rPr>
-      </w:pPr>
-    </w:p>
-    <w:p>
-      <w:pPr>
-        <w:pStyle w:val="Sinespaciado"/>
-        <w:rPr>
-          <w:rFonts w:ascii="Arial Narrow" w:hAnsi="Arial Narrow"/>
-          <w:b/>
-        </w:rPr>
-      </w:pPr>
-    </w:p>
-    <w:p>
-      <w:pPr>
-        <w:pStyle w:val="Sinespaciado"/>
-        <w:rPr>
-          <w:rFonts w:ascii="Arial Narrow" w:hAnsi="Arial Narrow"/>
-          <w:b/>
-        </w:rPr>
-      </w:pPr>
-    </w:p>
-    <w:p>
-      <w:pPr>
-        <w:pStyle w:val="Sinespaciado"/>
-        <w:rPr>
-          <w:rFonts w:ascii="Arial Narrow" w:hAnsi="Arial Narrow"/>
-          <w:b/>
-        </w:rPr>
-      </w:pPr>
-    </w:p>
-    <w:p>
-      <w:pPr>
-        <w:pStyle w:val="Sinespaciado"/>
-        <w:rPr>
-          <w:rFonts w:ascii="Arial Narrow" w:hAnsi="Arial Narrow"/>
-          <w:b/>
-        </w:rPr>
-      </w:pPr>
-    </w:p>
-    <w:p>
-      <w:pPr>
-        <w:pStyle w:val="Sinespaciado"/>
-        <w:jc w:val="right"/>
-        <w:rPr>
-          <w:rFonts w:ascii="Arial Narrow" w:hAnsi="Arial Narrow"/>
-          <w:b/>
-        </w:rPr>
-      </w:pPr>
-    </w:p>
-    <w:p>
-      <w:pPr>
-        <w:pStyle w:val="Sinespaciado"/>
-        <w:jc w:val="right"/>
-        <w:rPr>
-          <w:rFonts w:ascii="Arial Narrow" w:hAnsi="Arial Narrow"/>
-          <w:b/>
-        </w:rPr>
-      </w:pPr>
-    </w:p>
-    <w:p>
-      <w:pPr>
-        <w:pStyle w:val="Sinespaciado"/>
-        <w:jc w:val="right"/>
-        <w:rPr>
-          <w:rFonts w:ascii="Arial Narrow" w:hAnsi="Arial Narrow"/>
-          <w:b/>
-        </w:rPr>
-      </w:pPr>
-    </w:p>
-    <w:p>
-      <w:pPr>
-        <w:pStyle w:val="Sinespaciado"/>
-        <w:jc w:val="right"/>
         <w:rPr>
           <w:rFonts w:ascii="Arial Narrow" w:hAnsi="Arial Narrow"/>
           <w:b/>
@@ -1337,6 +945,225 @@
           <w:docGrid w:linePitch="360"/>
         </w:sectPr>
       </w:pPr>
+    </w:p>
+    <w:p>
+      <w:pPr>
+        <w:pStyle w:val="Sinespaciado"/>
+        <w:jc w:val="both"/>
+        <w:rPr>
+          <w:rFonts w:ascii="Arial Narrow" w:hAnsi="Arial Narrow"/>
+          <w:b/>
+        </w:rPr>
+      </w:pPr>
+    </w:p>
+    <w:p>
+      <w:pPr>
+        <w:pStyle w:val="Sinespaciado"/>
+        <w:ind w:left="-284"/>
+        <w:jc w:val="both"/>
+        <w:rPr>
+          <w:rFonts w:ascii="Arial Narrow" w:hAnsi="Arial Narrow"/>
+        </w:rPr>
+      </w:pPr>
+      <w:r>
+        <w:rPr>
+          <w:rFonts w:ascii="Arial Narrow" w:hAnsi="Arial Narrow"/>
+        </w:rPr>
+        <w:t>La Municipalidad está facultada para realizar labores de fiscalización de las actividades económicas autorizadas, con el fin de verificar el cumplimiento de las características autorizadas y su mantenimiento.</w:t>
+      </w:r>
+    </w:p>
+    <w:p>
+      <w:pPr>
+        <w:pStyle w:val="Sinespaciado"/>
+        <w:jc w:val="both"/>
+        <w:rPr>
+          <w:rFonts w:ascii="Arial Narrow" w:hAnsi="Arial Narrow"/>
+        </w:rPr>
+      </w:pPr>
+    </w:p>
+    <w:p>
+      <w:pPr>
+        <w:pStyle w:val="Sinespaciado"/>
+        <w:ind w:left="-284"/>
+        <w:jc w:val="both"/>
+        <w:rPr>
+          <w:rFonts w:ascii="Arial Narrow" w:hAnsi="Arial Narrow"/>
+        </w:rPr>
+      </w:pPr>
+      <w:r>
+        <w:rPr>
+          <w:rFonts w:ascii="Arial Narrow" w:hAnsi="Arial Narrow"/>
+          <w:b/>
+          <w:u w:val="single"/>
+        </w:rPr>
+        <w:t>OBSERVACIONES</w:t>
+      </w:r>
+      <w:r>
+        <w:rPr>
+          <w:rFonts w:ascii="Arial Narrow" w:hAnsi="Arial Narrow"/>
+        </w:rPr>
+        <w:t>:</w:t>
+      </w:r>
+    </w:p>
+    <w:p>
+      <w:pPr>
+        <w:pStyle w:val="Sinespaciado"/>
+        <w:jc w:val="both"/>
+        <w:rPr>
+          <w:rFonts w:ascii="Arial Narrow" w:hAnsi="Arial Narrow"/>
+        </w:rPr>
+      </w:pPr>
+    </w:p>
+    <w:p>
+      <w:pPr>
+        <w:pStyle w:val="Sinespaciado"/>
+        <w:ind w:left="-284"/>
+        <w:jc w:val="both"/>
+        <w:rPr>
+          <w:rFonts w:ascii="Arial Narrow" w:hAnsi="Arial Narrow"/>
+        </w:rPr>
+      </w:pPr>
+      <w:r>
+        <w:rPr>
+          <w:rFonts w:ascii="Arial Narrow" w:hAnsi="Arial Narrow"/>
+        </w:rPr>
+        <w:t>El establecimiento no debe ser objeto de quejas de vecinos fundadas, o de alterar o instalar un anuncio con características distintas a las autorizada bajo apercibimiento de aplicarse las sanciones correspondientes y la revocatoria de la autorización de la misma.</w:t>
+      </w:r>
+    </w:p>
+    <w:p>
+      <w:pPr>
+        <w:pStyle w:val="Sinespaciado"/>
+        <w:rPr>
+          <w:rFonts w:ascii="Arial Narrow" w:hAnsi="Arial Narrow"/>
+          <w:b/>
+        </w:rPr>
+      </w:pPr>
+    </w:p>
+    <w:p>
+      <w:pPr>
+        <w:pStyle w:val="Sinespaciado"/>
+        <w:rPr>
+          <w:rFonts w:ascii="Arial Narrow" w:hAnsi="Arial Narrow"/>
+          <w:b/>
+        </w:rPr>
+      </w:pPr>
+    </w:p>
+    <w:p>
+      <w:pPr>
+        <w:pStyle w:val="Sinespaciado"/>
+        <w:rPr>
+          <w:rFonts w:ascii="Arial Narrow" w:hAnsi="Arial Narrow"/>
+          <w:b/>
+        </w:rPr>
+      </w:pPr>
+    </w:p>
+    <w:p>
+      <w:pPr>
+        <w:pStyle w:val="Sinespaciado"/>
+        <w:rPr>
+          <w:rFonts w:ascii="Arial Narrow" w:hAnsi="Arial Narrow"/>
+          <w:b/>
+        </w:rPr>
+      </w:pPr>
+    </w:p>
+    <w:p>
+      <w:pPr>
+        <w:pStyle w:val="Sinespaciado"/>
+        <w:rPr>
+          <w:rFonts w:ascii="Arial Narrow" w:hAnsi="Arial Narrow"/>
+          <w:b/>
+        </w:rPr>
+      </w:pPr>
+    </w:p>
+    <w:p>
+      <w:pPr>
+        <w:pStyle w:val="Sinespaciado"/>
+        <w:rPr>
+          <w:rFonts w:ascii="Arial Narrow" w:hAnsi="Arial Narrow"/>
+          <w:b/>
+        </w:rPr>
+      </w:pPr>
+    </w:p>
+    <w:p>
+      <w:pPr>
+        <w:pStyle w:val="Sinespaciado"/>
+        <w:jc w:val="right"/>
+        <w:rPr>
+          <w:rFonts w:ascii="Arial Narrow" w:hAnsi="Arial Narrow"/>
+          <w:b/>
+        </w:rPr>
+      </w:pPr>
+    </w:p>
+    <w:p>
+      <w:pPr>
+        <w:pStyle w:val="Sinespaciado"/>
+        <w:jc w:val="right"/>
+        <w:rPr>
+          <w:rFonts w:ascii="Arial Narrow" w:hAnsi="Arial Narrow"/>
+          <w:b/>
+        </w:rPr>
+      </w:pPr>
+    </w:p>
+    <w:p>
+      <w:pPr>
+        <w:pStyle w:val="Sinespaciado"/>
+        <w:jc w:val="right"/>
+        <w:rPr>
+          <w:rFonts w:ascii="Arial Narrow" w:hAnsi="Arial Narrow"/>
+          <w:b/>
+        </w:rPr>
+      </w:pPr>
+    </w:p>
+    <w:p>
+      <w:pPr>
+        <w:pStyle w:val="Sinespaciado"/>
+        <w:jc w:val="right"/>
+        <w:rPr>
+          <w:rFonts w:ascii="Arial Narrow" w:hAnsi="Arial Narrow"/>
+          <w:b/>
+        </w:rPr>
+      </w:pPr>
+    </w:p>
+    <w:p>
+      <w:pPr>
+        <w:pStyle w:val="Sinespaciado"/>
+        <w:jc w:val="right"/>
+        <w:rPr>
+          <w:rFonts w:ascii="Arial Narrow" w:hAnsi="Arial Narrow"/>
+          <w:b/>
+        </w:rPr>
+      </w:pPr>
+    </w:p>
+    <w:p>
+      <w:pPr>
+        <w:pStyle w:val="Sinespaciado"/>
+        <w:jc w:val="right"/>
+        <w:rPr>
+          <w:rFonts w:ascii="Arial Narrow" w:hAnsi="Arial Narrow"/>
+          <w:b/>
+        </w:rPr>
+      </w:pPr>
+    </w:p>
+    <w:p>
+      <w:pPr>
+        <w:pStyle w:val="Sinespaciado"/>
+        <w:jc w:val="right"/>
+        <w:rPr>
+          <w:rFonts w:ascii="Arial Narrow" w:hAnsi="Arial Narrow"/>
+          <w:b/>
+        </w:rPr>
+      </w:pPr>
+    </w:p>
+    <w:p>
+      <w:pPr>
+        <w:pStyle w:val="Sinespaciado"/>
+        <w:ind w:left="4956" w:firstLine="708"/>
+        <w:jc w:val="both"/>
+        <w:rPr>
+          <w:rFonts w:ascii="Arial Narrow" w:hAnsi="Arial Narrow"/>
+          <w:b/>
+        </w:rPr>
+      </w:pPr>
       <w:r>
         <w:rPr>
           <w:rFonts w:ascii="Arial Narrow" w:hAnsi="Arial Narrow"/>
@@ -1353,7 +1180,7 @@
           </w:rPr>
           <w:id w:val="911356680"/>
           <w:placeholder>
-            <w:docPart w:val="E5025776E5BA4289ADF3E4616039062C"/>
+            <w:docPart w:val="4815FDAF89214314AF30281008CD0B67"/>
           </w:placeholder>
           <w:date>
             <w:dateFormat w:val="d 'de' MMMM 'de' yyyy"/>
@@ -1362,7 +1189,6 @@
             <w:calendar w:val="gregorian"/>
           </w:date>
         </w:sdtPr>
-        <w:sdtEndPr/>
         <w:sdtContent>
           <w:r>
             <w:rPr>
@@ -1374,16 +1200,6 @@
           </w:r>
         </w:sdtContent>
       </w:sdt>
-    </w:p>
-    <w:p>
-      <w:pPr>
-        <w:pStyle w:val="Sinespaciado"/>
-        <w:jc w:val="both"/>
-        <w:rPr>
-          <w:rFonts w:ascii="Arial Narrow" w:hAnsi="Arial Narrow"/>
-          <w:b/>
-        </w:rPr>
-      </w:pPr>
     </w:p>
     <w:sectPr>
       <w:headerReference w:type="even" r:id="rId12"/>
@@ -1607,7 +1423,7 @@
               <wp:lineTo x="0" y="0"/>
             </wp:wrapPolygon>
           </wp:wrapTight>
-          <wp:docPr id="267047701" name="Imagen 3"/>
+          <wp:docPr id="1" name="Imagen 3"/>
           <wp:cNvGraphicFramePr>
             <a:graphicFrameLocks xmlns:a="http://schemas.openxmlformats.org/drawingml/2006/main" noChangeAspect="1"/>
           </wp:cNvGraphicFramePr>
@@ -1681,7 +1497,7 @@
               <wp:lineTo x="4717" y="726"/>
             </wp:wrapPolygon>
           </wp:wrapTight>
-          <wp:docPr id="1486672326" name="Imagen 1"/>
+          <wp:docPr id="3" name="Imagen 1"/>
           <wp:cNvGraphicFramePr>
             <a:graphicFrameLocks xmlns:a="http://schemas.openxmlformats.org/drawingml/2006/main" noChangeAspect="1"/>
           </wp:cNvGraphicFramePr>
@@ -1745,7 +1561,7 @@
           <wp:extent cx="7689215" cy="5248910"/>
           <wp:effectExtent l="0" t="0" r="6985" b="8890"/>
           <wp:wrapNone/>
-          <wp:docPr id="2" name="Imagen 2"/>
+          <wp:docPr id="4" name="Imagen 4"/>
           <wp:cNvGraphicFramePr>
             <a:graphicFrameLocks xmlns:a="http://schemas.openxmlformats.org/drawingml/2006/main" noChangeAspect="1"/>
           </wp:cNvGraphicFramePr>
@@ -2712,7 +2528,7 @@
   <w:docParts>
     <w:docPart>
       <w:docPartPr>
-        <w:name w:val="E5025776E5BA4289ADF3E4616039062C"/>
+        <w:name w:val="4815FDAF89214314AF30281008CD0B67"/>
         <w:category>
           <w:name w:val="General"/>
           <w:gallery w:val="placeholder"/>
@@ -2723,12 +2539,12 @@
         <w:behaviors>
           <w:behavior w:val="content"/>
         </w:behaviors>
-        <w:guid w:val="{D9D31A1D-0CF2-4D57-8B1C-AD47053BE956}"/>
+        <w:guid w:val="{E727C9A9-FF07-4381-B813-D51D4845678B}"/>
       </w:docPartPr>
       <w:docPartBody>
         <w:p>
           <w:pPr>
-            <w:pStyle w:val="E5025776E5BA4289ADF3E4616039062C"/>
+            <w:pStyle w:val="4815FDAF89214314AF30281008CD0B67"/>
           </w:pPr>
           <w:r>
             <w:rPr>
@@ -2832,9 +2648,11 @@
     <w:rsid w:val="00434534"/>
     <w:rsid w:val="00676464"/>
     <w:rsid w:val="00766428"/>
+    <w:rsid w:val="008F4E4F"/>
     <w:rsid w:val="0090163D"/>
     <w:rsid w:val="009731F1"/>
     <w:rsid w:val="00981D44"/>
+    <w:rsid w:val="00A81B3B"/>
     <w:rsid w:val="00CA6E63"/>
     <w:rsid w:val="00D36AC1"/>
     <w:rsid w:val="00D40337"/>
@@ -3297,7 +3115,7 @@
     <w:basedOn w:val="Fuentedeprrafopredeter"/>
     <w:uiPriority w:val="99"/>
     <w:semiHidden/>
-    <w:rsid w:val="00981D44"/>
+    <w:rsid w:val="008F4E4F"/>
     <w:rPr>
       <w:color w:val="808080"/>
     </w:rPr>
@@ -3305,6 +3123,30 @@
   <w:style w:type="paragraph" w:customStyle="1" w:styleId="E5025776E5BA4289ADF3E4616039062C">
     <w:name w:val="E5025776E5BA4289ADF3E4616039062C"/>
     <w:rsid w:val="00D40337"/>
+  </w:style>
+  <w:style w:type="paragraph" w:customStyle="1" w:styleId="70264D59EE544BED8AC5DAFAD9C0FE9B">
+    <w:name w:val="70264D59EE544BED8AC5DAFAD9C0FE9B"/>
+    <w:rsid w:val="008F4E4F"/>
+    <w:rPr>
+      <w:kern w:val="0"/>
+      <w14:ligatures w14:val="none"/>
+    </w:rPr>
+  </w:style>
+  <w:style w:type="paragraph" w:customStyle="1" w:styleId="D04C6925C12C482AA1079EAEE7E8AC62">
+    <w:name w:val="D04C6925C12C482AA1079EAEE7E8AC62"/>
+    <w:rsid w:val="008F4E4F"/>
+    <w:rPr>
+      <w:kern w:val="0"/>
+      <w14:ligatures w14:val="none"/>
+    </w:rPr>
+  </w:style>
+  <w:style w:type="paragraph" w:customStyle="1" w:styleId="4815FDAF89214314AF30281008CD0B67">
+    <w:name w:val="4815FDAF89214314AF30281008CD0B67"/>
+    <w:rsid w:val="008F4E4F"/>
+    <w:rPr>
+      <w:kern w:val="0"/>
+      <w14:ligatures w14:val="none"/>
+    </w:rPr>
   </w:style>
 </w:styles>
 </file>

</xml_diff>